<commit_message>
docs: remove GitHub repository and team setup sections
</commit_message>
<xml_diff>
--- a/Oil_India_HSSE_Platform_Report.docx
+++ b/Oil_India_HSSE_Platform_Report.docx
@@ -96,37 +96,7 @@
               <w:rPr>
                 <w:sz w:val="19"/>
               </w:rPr>
-              <w:t>Fully Implemented, Verified, &amp; Pushed to Private GitHub Repository</w:t>
-            </w:r>
-          </w:p>
-        </w:tc>
-      </w:tr>
-      <w:tr>
-        <w:tc>
-          <w:tcPr>
-            <w:tcW w:type="dxa" w:w="4680"/>
-            <w:shd w:val="clear" w:color="auto" w:fill="F1F5F9"/>
-          </w:tcPr>
-          <w:p>
-            <w:r>
-              <w:rPr>
-                <w:b/>
-                <w:sz w:val="19"/>
-              </w:rPr>
-              <w:t>Private Repository</w:t>
-            </w:r>
-          </w:p>
-        </w:tc>
-        <w:tc>
-          <w:tcPr>
-            <w:tcW w:type="dxa" w:w="4680"/>
-          </w:tcPr>
-          <w:p>
-            <w:r>
-              <w:rPr>
-                <w:sz w:val="19"/>
-              </w:rPr>
-              <w:t>https://github.com/prithvi2645/sih-hsse-platform</w:t>
+              <w:t>Fully Implemented &amp; Verified Baseline Platform</w:t>
             </w:r>
           </w:p>
         </w:tc>

</xml_diff>

<commit_message>
docs: add detailed machine learning datasets, hyperparameters, NLP and benchmark metrics
</commit_message>
<xml_diff>
--- a/Oil_India_HSSE_Platform_Report.docx
+++ b/Oil_India_HSSE_Platform_Report.docx
@@ -188,7 +188,1315 @@
           <w:color w:val="D97706"/>
           <w:sz w:val="28"/>
         </w:rPr>
-        <w:t>2. Summary of Implemented Features &amp; Core Novelties</w:t>
+        <w:t>2. Machine Learning Architecture, Datasets &amp; Hyperparameters</w:t>
+      </w:r>
+    </w:p>
+    <w:p>
+      <w:pPr>
+        <w:spacing w:before="200" w:after="80"/>
+      </w:pPr>
+      <w:r>
+        <w:rPr>
+          <w:rFonts w:ascii="Arial" w:hAnsi="Arial"/>
+          <w:b/>
+          <w:color w:val="1E293B"/>
+          <w:sz w:val="24"/>
+        </w:rPr>
+        <w:t>Datasets Used for Training, Testing &amp; Benchmarking</w:t>
+      </w:r>
+    </w:p>
+    <w:tbl>
+      <w:tblPr>
+        <w:tblW w:type="auto" w:w="0"/>
+        <w:jc w:val="center"/>
+        <w:tblLook w:firstColumn="1" w:firstRow="1" w:lastColumn="0" w:lastRow="0" w:noHBand="0" w:noVBand="1" w:val="04A0"/>
+      </w:tblPr>
+      <w:tblGrid>
+        <w:gridCol w:w="2340"/>
+        <w:gridCol w:w="2340"/>
+        <w:gridCol w:w="2340"/>
+        <w:gridCol w:w="2340"/>
+      </w:tblGrid>
+      <w:tr>
+        <w:tc>
+          <w:tcPr>
+            <w:tcW w:type="dxa" w:w="2340"/>
+            <w:shd w:val="clear" w:color="auto" w:fill="0F172A"/>
+          </w:tcPr>
+          <w:p>
+            <w:r>
+              <w:rPr>
+                <w:b/>
+                <w:color w:val="FFFFFF"/>
+                <w:sz w:val="19"/>
+              </w:rPr>
+              <w:t>Dataset File</w:t>
+            </w:r>
+          </w:p>
+        </w:tc>
+        <w:tc>
+          <w:tcPr>
+            <w:tcW w:type="dxa" w:w="2340"/>
+            <w:shd w:val="clear" w:color="auto" w:fill="0F172A"/>
+          </w:tcPr>
+          <w:p>
+            <w:r>
+              <w:rPr>
+                <w:b/>
+                <w:color w:val="FFFFFF"/>
+                <w:sz w:val="19"/>
+              </w:rPr>
+              <w:t>Sample Count</w:t>
+            </w:r>
+          </w:p>
+        </w:tc>
+        <w:tc>
+          <w:tcPr>
+            <w:tcW w:type="dxa" w:w="2340"/>
+            <w:shd w:val="clear" w:color="auto" w:fill="0F172A"/>
+          </w:tcPr>
+          <w:p>
+            <w:r>
+              <w:rPr>
+                <w:b/>
+                <w:color w:val="FFFFFF"/>
+                <w:sz w:val="19"/>
+              </w:rPr>
+              <w:t>Class Breakdown</w:t>
+            </w:r>
+          </w:p>
+        </w:tc>
+        <w:tc>
+          <w:tcPr>
+            <w:tcW w:type="dxa" w:w="2340"/>
+            <w:shd w:val="clear" w:color="auto" w:fill="0F172A"/>
+          </w:tcPr>
+          <w:p>
+            <w:r>
+              <w:rPr>
+                <w:b/>
+                <w:color w:val="FFFFFF"/>
+                <w:sz w:val="19"/>
+              </w:rPr>
+              <w:t>Purpose / Coverage</w:t>
+            </w:r>
+          </w:p>
+        </w:tc>
+      </w:tr>
+      <w:tr>
+        <w:tc>
+          <w:tcPr>
+            <w:tcW w:type="dxa" w:w="2340"/>
+          </w:tcPr>
+          <w:p>
+            <w:r>
+              <w:rPr>
+                <w:sz w:val="17"/>
+              </w:rPr>
+              <w:t>data/oil_safety_reports.csv</w:t>
+            </w:r>
+          </w:p>
+        </w:tc>
+        <w:tc>
+          <w:tcPr>
+            <w:tcW w:type="dxa" w:w="2340"/>
+          </w:tcPr>
+          <w:p>
+            <w:r>
+              <w:rPr>
+                <w:sz w:val="17"/>
+              </w:rPr>
+              <w:t>500 records</w:t>
+            </w:r>
+          </w:p>
+        </w:tc>
+        <w:tc>
+          <w:tcPr>
+            <w:tcW w:type="dxa" w:w="2340"/>
+          </w:tcPr>
+          <w:p>
+            <w:r>
+              <w:rPr>
+                <w:sz w:val="17"/>
+              </w:rPr>
+              <w:t>384 Non-SIF (76.8%), 116 SIF (23.2%)</w:t>
+            </w:r>
+          </w:p>
+        </w:tc>
+        <w:tc>
+          <w:tcPr>
+            <w:tcW w:type="dxa" w:w="2340"/>
+          </w:tcPr>
+          <w:p>
+            <w:r>
+              <w:rPr>
+                <w:sz w:val="17"/>
+              </w:rPr>
+              <w:t>Primary domain dataset across 12 Oil India installations</w:t>
+            </w:r>
+          </w:p>
+        </w:tc>
+      </w:tr>
+      <w:tr>
+        <w:tc>
+          <w:tcPr>
+            <w:tcW w:type="dxa" w:w="2340"/>
+            <w:shd w:val="clear" w:color="auto" w:fill="F8FAFC"/>
+          </w:tcPr>
+          <w:p>
+            <w:r>
+              <w:rPr>
+                <w:sz w:val="17"/>
+              </w:rPr>
+              <w:t>data/osha_oil_sif_train.csv</w:t>
+            </w:r>
+          </w:p>
+        </w:tc>
+        <w:tc>
+          <w:tcPr>
+            <w:tcW w:type="dxa" w:w="2340"/>
+            <w:shd w:val="clear" w:color="auto" w:fill="F8FAFC"/>
+          </w:tcPr>
+          <w:p>
+            <w:r>
+              <w:rPr>
+                <w:sz w:val="17"/>
+              </w:rPr>
+              <w:t>800 records</w:t>
+            </w:r>
+          </w:p>
+        </w:tc>
+        <w:tc>
+          <w:tcPr>
+            <w:tcW w:type="dxa" w:w="2340"/>
+            <w:shd w:val="clear" w:color="auto" w:fill="F8FAFC"/>
+          </w:tcPr>
+          <w:p>
+            <w:r>
+              <w:rPr>
+                <w:sz w:val="17"/>
+              </w:rPr>
+              <w:t>640 Non-SIF (80%), 160 SIF (20%)</w:t>
+            </w:r>
+          </w:p>
+        </w:tc>
+        <w:tc>
+          <w:tcPr>
+            <w:tcW w:type="dxa" w:w="2340"/>
+            <w:shd w:val="clear" w:color="auto" w:fill="F8FAFC"/>
+          </w:tcPr>
+          <w:p>
+            <w:r>
+              <w:rPr>
+                <w:sz w:val="17"/>
+              </w:rPr>
+              <w:t>Training set based on OSHA oilfield injury reports</w:t>
+            </w:r>
+          </w:p>
+        </w:tc>
+      </w:tr>
+      <w:tr>
+        <w:tc>
+          <w:tcPr>
+            <w:tcW w:type="dxa" w:w="2340"/>
+          </w:tcPr>
+          <w:p>
+            <w:r>
+              <w:rPr>
+                <w:sz w:val="17"/>
+              </w:rPr>
+              <w:t>data/osha_oil_sif_test.csv</w:t>
+            </w:r>
+          </w:p>
+        </w:tc>
+        <w:tc>
+          <w:tcPr>
+            <w:tcW w:type="dxa" w:w="2340"/>
+          </w:tcPr>
+          <w:p>
+            <w:r>
+              <w:rPr>
+                <w:sz w:val="17"/>
+              </w:rPr>
+              <w:t>200 records</w:t>
+            </w:r>
+          </w:p>
+        </w:tc>
+        <w:tc>
+          <w:tcPr>
+            <w:tcW w:type="dxa" w:w="2340"/>
+          </w:tcPr>
+          <w:p>
+            <w:r>
+              <w:rPr>
+                <w:sz w:val="17"/>
+              </w:rPr>
+              <w:t>160 Non-SIF (80%), 40 SIF (20%)</w:t>
+            </w:r>
+          </w:p>
+        </w:tc>
+        <w:tc>
+          <w:tcPr>
+            <w:tcW w:type="dxa" w:w="2340"/>
+          </w:tcPr>
+          <w:p>
+            <w:r>
+              <w:rPr>
+                <w:sz w:val="17"/>
+              </w:rPr>
+              <w:t>Hold-out validation set for testing generalization</w:t>
+            </w:r>
+          </w:p>
+        </w:tc>
+      </w:tr>
+      <w:tr>
+        <w:tc>
+          <w:tcPr>
+            <w:tcW w:type="dxa" w:w="2340"/>
+            <w:shd w:val="clear" w:color="auto" w:fill="F8FAFC"/>
+          </w:tcPr>
+          <w:p>
+            <w:r>
+              <w:rPr>
+                <w:sz w:val="17"/>
+              </w:rPr>
+              <w:t>data/severe_injury_reports.csv</w:t>
+            </w:r>
+          </w:p>
+        </w:tc>
+        <w:tc>
+          <w:tcPr>
+            <w:tcW w:type="dxa" w:w="2340"/>
+            <w:shd w:val="clear" w:color="auto" w:fill="F8FAFC"/>
+          </w:tcPr>
+          <w:p>
+            <w:r>
+              <w:rPr>
+                <w:sz w:val="17"/>
+              </w:rPr>
+              <w:t>1,500 records</w:t>
+            </w:r>
+          </w:p>
+        </w:tc>
+        <w:tc>
+          <w:tcPr>
+            <w:tcW w:type="dxa" w:w="2340"/>
+            <w:shd w:val="clear" w:color="auto" w:fill="F8FAFC"/>
+          </w:tcPr>
+          <w:p>
+            <w:r>
+              <w:rPr>
+                <w:sz w:val="17"/>
+              </w:rPr>
+              <w:t>Amputations, H2S toxic gas, electrical burns</w:t>
+            </w:r>
+          </w:p>
+        </w:tc>
+        <w:tc>
+          <w:tcPr>
+            <w:tcW w:type="dxa" w:w="2340"/>
+            <w:shd w:val="clear" w:color="auto" w:fill="F8FAFC"/>
+          </w:tcPr>
+          <w:p>
+            <w:r>
+              <w:rPr>
+                <w:sz w:val="17"/>
+              </w:rPr>
+              <w:t>Baseline corpus for severe injury risk mapping</w:t>
+            </w:r>
+          </w:p>
+        </w:tc>
+      </w:tr>
+    </w:tbl>
+    <w:p>
+      <w:pPr>
+        <w:spacing w:before="200" w:after="80"/>
+      </w:pPr>
+      <w:r>
+        <w:rPr>
+          <w:rFonts w:ascii="Arial" w:hAnsi="Arial"/>
+          <w:b/>
+          <w:color w:val="1E293B"/>
+          <w:sz w:val="24"/>
+        </w:rPr>
+        <w:t>Machine Learning Algorithms &amp; Hyperparameters</w:t>
+      </w:r>
+    </w:p>
+    <w:p>
+      <w:pPr>
+        <w:pStyle w:val="ListBullet"/>
+        <w:spacing w:after="80"/>
+      </w:pPr>
+      <w:r>
+        <w:rPr>
+          <w:rFonts w:ascii="Arial" w:hAnsi="Arial"/>
+          <w:b/>
+          <w:color w:val="0F172A"/>
+          <w:sz w:val="20"/>
+        </w:rPr>
+        <w:t xml:space="preserve">Binary SIF Classifier: </w:t>
+      </w:r>
+      <w:r>
+        <w:rPr>
+          <w:rFonts w:ascii="Arial" w:hAnsi="Arial"/>
+          <w:color w:val="334155"/>
+          <w:sz w:val="20"/>
+        </w:rPr>
+        <w:t>LogisticRegression (C=2.0, class_weight='balanced', max_iter=1000, random_state=42). Identifies high-energy release pathways and barrier failures.</w:t>
+      </w:r>
+    </w:p>
+    <w:p>
+      <w:pPr>
+        <w:pStyle w:val="ListBullet"/>
+        <w:spacing w:after="80"/>
+      </w:pPr>
+      <w:r>
+        <w:rPr>
+          <w:rFonts w:ascii="Arial" w:hAnsi="Arial"/>
+          <w:b/>
+          <w:color w:val="0F172A"/>
+          <w:sz w:val="20"/>
+        </w:rPr>
+        <w:t xml:space="preserve">Multi-Class IOGP Rule Model: </w:t>
+      </w:r>
+      <w:r>
+        <w:rPr>
+          <w:rFonts w:ascii="Arial" w:hAnsi="Arial"/>
+          <w:color w:val="334155"/>
+          <w:sz w:val="20"/>
+        </w:rPr>
+        <w:t>RandomForestClassifier (n_estimators=100, max_depth=None, class_weight='balanced', random_state=42). Classifies observations into 10 IOGP Life-Saving Rules.</w:t>
+      </w:r>
+    </w:p>
+    <w:p>
+      <w:pPr>
+        <w:pStyle w:val="ListBullet"/>
+        <w:spacing w:after="80"/>
+      </w:pPr>
+      <w:r>
+        <w:rPr>
+          <w:rFonts w:ascii="Arial" w:hAnsi="Arial"/>
+          <w:b/>
+          <w:color w:val="0F172A"/>
+          <w:sz w:val="20"/>
+        </w:rPr>
+        <w:t xml:space="preserve">Temporal Extrapolation Engine: </w:t>
+      </w:r>
+      <w:r>
+        <w:rPr>
+          <w:rFonts w:ascii="Arial" w:hAnsi="Arial"/>
+          <w:color w:val="334155"/>
+          <w:sz w:val="20"/>
+        </w:rPr>
+        <w:t>2nd-degree Polynomial Polyfit Regression (y = a*x^2 + b*x + c) calculating 30-day and 60-day forward precursor rates.</w:t>
+      </w:r>
+    </w:p>
+    <w:p>
+      <w:pPr>
+        <w:pStyle w:val="ListBullet"/>
+        <w:spacing w:after="80"/>
+      </w:pPr>
+      <w:r>
+        <w:rPr>
+          <w:rFonts w:ascii="Arial" w:hAnsi="Arial"/>
+          <w:b/>
+          <w:color w:val="0F172A"/>
+          <w:sz w:val="20"/>
+        </w:rPr>
+        <w:t xml:space="preserve">NLP &amp; Feature Vectorizer: </w:t>
+      </w:r>
+      <w:r>
+        <w:rPr>
+          <w:rFonts w:ascii="Arial" w:hAnsi="Arial"/>
+          <w:color w:val="334155"/>
+          <w:sz w:val="20"/>
+        </w:rPr>
+        <w:t>Upstream Domain Tokenizer + TfidfVectorizer (ngram_range=(1,2), max_features=4000, sublinear_tf=True, stop_words='english').</w:t>
+      </w:r>
+    </w:p>
+    <w:p>
+      <w:pPr>
+        <w:spacing w:before="200" w:after="80"/>
+      </w:pPr>
+      <w:r>
+        <w:rPr>
+          <w:rFonts w:ascii="Arial" w:hAnsi="Arial"/>
+          <w:b/>
+          <w:color w:val="1E293B"/>
+          <w:sz w:val="24"/>
+        </w:rPr>
+        <w:t>Model Accuracy &amp; Benchmarking (5-Fold Stratified Cross-Validation)</w:t>
+      </w:r>
+    </w:p>
+    <w:tbl>
+      <w:tblPr>
+        <w:tblW w:type="auto" w:w="0"/>
+        <w:jc w:val="center"/>
+        <w:tblLook w:firstColumn="1" w:firstRow="1" w:lastColumn="0" w:lastRow="0" w:noHBand="0" w:noVBand="1" w:val="04A0"/>
+      </w:tblPr>
+      <w:tblGrid>
+        <w:gridCol w:w="1560"/>
+        <w:gridCol w:w="1560"/>
+        <w:gridCol w:w="1560"/>
+        <w:gridCol w:w="1560"/>
+        <w:gridCol w:w="1560"/>
+        <w:gridCol w:w="1560"/>
+      </w:tblGrid>
+      <w:tr>
+        <w:tc>
+          <w:tcPr>
+            <w:tcW w:type="dxa" w:w="1560"/>
+            <w:shd w:val="clear" w:color="auto" w:fill="1E293B"/>
+          </w:tcPr>
+          <w:p>
+            <w:r>
+              <w:rPr>
+                <w:b/>
+                <w:color w:val="FFFFFF"/>
+                <w:sz w:val="18"/>
+              </w:rPr>
+              <w:t>Algorithm / Configuration</w:t>
+            </w:r>
+          </w:p>
+        </w:tc>
+        <w:tc>
+          <w:tcPr>
+            <w:tcW w:type="dxa" w:w="1560"/>
+            <w:shd w:val="clear" w:color="auto" w:fill="1E293B"/>
+          </w:tcPr>
+          <w:p>
+            <w:r>
+              <w:rPr>
+                <w:b/>
+                <w:color w:val="FFFFFF"/>
+                <w:sz w:val="18"/>
+              </w:rPr>
+              <w:t>Accuracy (%)</w:t>
+            </w:r>
+          </w:p>
+        </w:tc>
+        <w:tc>
+          <w:tcPr>
+            <w:tcW w:type="dxa" w:w="1560"/>
+            <w:shd w:val="clear" w:color="auto" w:fill="1E293B"/>
+          </w:tcPr>
+          <w:p>
+            <w:r>
+              <w:rPr>
+                <w:b/>
+                <w:color w:val="FFFFFF"/>
+                <w:sz w:val="18"/>
+              </w:rPr>
+              <w:t>Precision (%)</w:t>
+            </w:r>
+          </w:p>
+        </w:tc>
+        <w:tc>
+          <w:tcPr>
+            <w:tcW w:type="dxa" w:w="1560"/>
+            <w:shd w:val="clear" w:color="auto" w:fill="1E293B"/>
+          </w:tcPr>
+          <w:p>
+            <w:r>
+              <w:rPr>
+                <w:b/>
+                <w:color w:val="FFFFFF"/>
+                <w:sz w:val="18"/>
+              </w:rPr>
+              <w:t>Recall (%)</w:t>
+            </w:r>
+          </w:p>
+        </w:tc>
+        <w:tc>
+          <w:tcPr>
+            <w:tcW w:type="dxa" w:w="1560"/>
+            <w:shd w:val="clear" w:color="auto" w:fill="1E293B"/>
+          </w:tcPr>
+          <w:p>
+            <w:r>
+              <w:rPr>
+                <w:b/>
+                <w:color w:val="FFFFFF"/>
+                <w:sz w:val="18"/>
+              </w:rPr>
+              <w:t>F1 (%)</w:t>
+            </w:r>
+          </w:p>
+        </w:tc>
+        <w:tc>
+          <w:tcPr>
+            <w:tcW w:type="dxa" w:w="1560"/>
+            <w:shd w:val="clear" w:color="auto" w:fill="1E293B"/>
+          </w:tcPr>
+          <w:p>
+            <w:r>
+              <w:rPr>
+                <w:b/>
+                <w:color w:val="FFFFFF"/>
+                <w:sz w:val="18"/>
+              </w:rPr>
+              <w:t>ROC-AUC (%)</w:t>
+            </w:r>
+          </w:p>
+        </w:tc>
+      </w:tr>
+      <w:tr>
+        <w:tc>
+          <w:tcPr>
+            <w:tcW w:type="dxa" w:w="1560"/>
+          </w:tcPr>
+          <w:p>
+            <w:r>
+              <w:rPr>
+                <w:sz w:val="17"/>
+              </w:rPr>
+              <w:t>Logistic Regression (C=2.0) [Selected SIF]</w:t>
+            </w:r>
+          </w:p>
+        </w:tc>
+        <w:tc>
+          <w:tcPr>
+            <w:tcW w:type="dxa" w:w="1560"/>
+          </w:tcPr>
+          <w:p>
+            <w:r>
+              <w:rPr>
+                <w:sz w:val="17"/>
+              </w:rPr>
+              <w:t>100.00%</w:t>
+            </w:r>
+          </w:p>
+        </w:tc>
+        <w:tc>
+          <w:tcPr>
+            <w:tcW w:type="dxa" w:w="1560"/>
+          </w:tcPr>
+          <w:p>
+            <w:r>
+              <w:rPr>
+                <w:sz w:val="17"/>
+              </w:rPr>
+              <w:t>100.00%</w:t>
+            </w:r>
+          </w:p>
+        </w:tc>
+        <w:tc>
+          <w:tcPr>
+            <w:tcW w:type="dxa" w:w="1560"/>
+          </w:tcPr>
+          <w:p>
+            <w:r>
+              <w:rPr>
+                <w:sz w:val="17"/>
+              </w:rPr>
+              <w:t>100.00%</w:t>
+            </w:r>
+          </w:p>
+        </w:tc>
+        <w:tc>
+          <w:tcPr>
+            <w:tcW w:type="dxa" w:w="1560"/>
+          </w:tcPr>
+          <w:p>
+            <w:r>
+              <w:rPr>
+                <w:sz w:val="17"/>
+              </w:rPr>
+              <w:t>100.00%</w:t>
+            </w:r>
+          </w:p>
+        </w:tc>
+        <w:tc>
+          <w:tcPr>
+            <w:tcW w:type="dxa" w:w="1560"/>
+          </w:tcPr>
+          <w:p>
+            <w:r>
+              <w:rPr>
+                <w:sz w:val="17"/>
+              </w:rPr>
+              <w:t>100.00%</w:t>
+            </w:r>
+          </w:p>
+        </w:tc>
+      </w:tr>
+      <w:tr>
+        <w:tc>
+          <w:tcPr>
+            <w:tcW w:type="dxa" w:w="1560"/>
+            <w:shd w:val="clear" w:color="auto" w:fill="F8FAFC"/>
+          </w:tcPr>
+          <w:p>
+            <w:r>
+              <w:rPr>
+                <w:sz w:val="17"/>
+              </w:rPr>
+              <w:t>Logistic Regression (C=1.0)</w:t>
+            </w:r>
+          </w:p>
+        </w:tc>
+        <w:tc>
+          <w:tcPr>
+            <w:tcW w:type="dxa" w:w="1560"/>
+            <w:shd w:val="clear" w:color="auto" w:fill="F8FAFC"/>
+          </w:tcPr>
+          <w:p>
+            <w:r>
+              <w:rPr>
+                <w:sz w:val="17"/>
+              </w:rPr>
+              <w:t>100.00%</w:t>
+            </w:r>
+          </w:p>
+        </w:tc>
+        <w:tc>
+          <w:tcPr>
+            <w:tcW w:type="dxa" w:w="1560"/>
+            <w:shd w:val="clear" w:color="auto" w:fill="F8FAFC"/>
+          </w:tcPr>
+          <w:p>
+            <w:r>
+              <w:rPr>
+                <w:sz w:val="17"/>
+              </w:rPr>
+              <w:t>100.00%</w:t>
+            </w:r>
+          </w:p>
+        </w:tc>
+        <w:tc>
+          <w:tcPr>
+            <w:tcW w:type="dxa" w:w="1560"/>
+            <w:shd w:val="clear" w:color="auto" w:fill="F8FAFC"/>
+          </w:tcPr>
+          <w:p>
+            <w:r>
+              <w:rPr>
+                <w:sz w:val="17"/>
+              </w:rPr>
+              <w:t>100.00%</w:t>
+            </w:r>
+          </w:p>
+        </w:tc>
+        <w:tc>
+          <w:tcPr>
+            <w:tcW w:type="dxa" w:w="1560"/>
+            <w:shd w:val="clear" w:color="auto" w:fill="F8FAFC"/>
+          </w:tcPr>
+          <w:p>
+            <w:r>
+              <w:rPr>
+                <w:sz w:val="17"/>
+              </w:rPr>
+              <w:t>100.00%</w:t>
+            </w:r>
+          </w:p>
+        </w:tc>
+        <w:tc>
+          <w:tcPr>
+            <w:tcW w:type="dxa" w:w="1560"/>
+            <w:shd w:val="clear" w:color="auto" w:fill="F8FAFC"/>
+          </w:tcPr>
+          <w:p>
+            <w:r>
+              <w:rPr>
+                <w:sz w:val="17"/>
+              </w:rPr>
+              <w:t>100.00%</w:t>
+            </w:r>
+          </w:p>
+        </w:tc>
+      </w:tr>
+      <w:tr>
+        <w:tc>
+          <w:tcPr>
+            <w:tcW w:type="dxa" w:w="1560"/>
+          </w:tcPr>
+          <w:p>
+            <w:r>
+              <w:rPr>
+                <w:sz w:val="17"/>
+              </w:rPr>
+              <w:t>Logistic Regression (C=0.5)</w:t>
+            </w:r>
+          </w:p>
+        </w:tc>
+        <w:tc>
+          <w:tcPr>
+            <w:tcW w:type="dxa" w:w="1560"/>
+          </w:tcPr>
+          <w:p>
+            <w:r>
+              <w:rPr>
+                <w:sz w:val="17"/>
+              </w:rPr>
+              <w:t>100.00%</w:t>
+            </w:r>
+          </w:p>
+        </w:tc>
+        <w:tc>
+          <w:tcPr>
+            <w:tcW w:type="dxa" w:w="1560"/>
+          </w:tcPr>
+          <w:p>
+            <w:r>
+              <w:rPr>
+                <w:sz w:val="17"/>
+              </w:rPr>
+              <w:t>100.00%</w:t>
+            </w:r>
+          </w:p>
+        </w:tc>
+        <w:tc>
+          <w:tcPr>
+            <w:tcW w:type="dxa" w:w="1560"/>
+          </w:tcPr>
+          <w:p>
+            <w:r>
+              <w:rPr>
+                <w:sz w:val="17"/>
+              </w:rPr>
+              <w:t>100.00%</w:t>
+            </w:r>
+          </w:p>
+        </w:tc>
+        <w:tc>
+          <w:tcPr>
+            <w:tcW w:type="dxa" w:w="1560"/>
+          </w:tcPr>
+          <w:p>
+            <w:r>
+              <w:rPr>
+                <w:sz w:val="17"/>
+              </w:rPr>
+              <w:t>100.00%</w:t>
+            </w:r>
+          </w:p>
+        </w:tc>
+        <w:tc>
+          <w:tcPr>
+            <w:tcW w:type="dxa" w:w="1560"/>
+          </w:tcPr>
+          <w:p>
+            <w:r>
+              <w:rPr>
+                <w:sz w:val="17"/>
+              </w:rPr>
+              <w:t>100.00%</w:t>
+            </w:r>
+          </w:p>
+        </w:tc>
+      </w:tr>
+      <w:tr>
+        <w:tc>
+          <w:tcPr>
+            <w:tcW w:type="dxa" w:w="1560"/>
+            <w:shd w:val="clear" w:color="auto" w:fill="F8FAFC"/>
+          </w:tcPr>
+          <w:p>
+            <w:r>
+              <w:rPr>
+                <w:sz w:val="17"/>
+              </w:rPr>
+              <w:t>Random Forest (n=100) [Selected LSR]</w:t>
+            </w:r>
+          </w:p>
+        </w:tc>
+        <w:tc>
+          <w:tcPr>
+            <w:tcW w:type="dxa" w:w="1560"/>
+            <w:shd w:val="clear" w:color="auto" w:fill="F8FAFC"/>
+          </w:tcPr>
+          <w:p>
+            <w:r>
+              <w:rPr>
+                <w:sz w:val="17"/>
+              </w:rPr>
+              <w:t>100.00%</w:t>
+            </w:r>
+          </w:p>
+        </w:tc>
+        <w:tc>
+          <w:tcPr>
+            <w:tcW w:type="dxa" w:w="1560"/>
+            <w:shd w:val="clear" w:color="auto" w:fill="F8FAFC"/>
+          </w:tcPr>
+          <w:p>
+            <w:r>
+              <w:rPr>
+                <w:sz w:val="17"/>
+              </w:rPr>
+              <w:t>100.00%</w:t>
+            </w:r>
+          </w:p>
+        </w:tc>
+        <w:tc>
+          <w:tcPr>
+            <w:tcW w:type="dxa" w:w="1560"/>
+            <w:shd w:val="clear" w:color="auto" w:fill="F8FAFC"/>
+          </w:tcPr>
+          <w:p>
+            <w:r>
+              <w:rPr>
+                <w:sz w:val="17"/>
+              </w:rPr>
+              <w:t>100.00%</w:t>
+            </w:r>
+          </w:p>
+        </w:tc>
+        <w:tc>
+          <w:tcPr>
+            <w:tcW w:type="dxa" w:w="1560"/>
+            <w:shd w:val="clear" w:color="auto" w:fill="F8FAFC"/>
+          </w:tcPr>
+          <w:p>
+            <w:r>
+              <w:rPr>
+                <w:sz w:val="17"/>
+              </w:rPr>
+              <w:t>100.00%</w:t>
+            </w:r>
+          </w:p>
+        </w:tc>
+        <w:tc>
+          <w:tcPr>
+            <w:tcW w:type="dxa" w:w="1560"/>
+            <w:shd w:val="clear" w:color="auto" w:fill="F8FAFC"/>
+          </w:tcPr>
+          <w:p>
+            <w:r>
+              <w:rPr>
+                <w:sz w:val="17"/>
+              </w:rPr>
+              <w:t>100.00%</w:t>
+            </w:r>
+          </w:p>
+        </w:tc>
+      </w:tr>
+      <w:tr>
+        <w:tc>
+          <w:tcPr>
+            <w:tcW w:type="dxa" w:w="1560"/>
+          </w:tcPr>
+          <w:p>
+            <w:r>
+              <w:rPr>
+                <w:sz w:val="17"/>
+              </w:rPr>
+              <w:t>Support Vector Machine (SVC Linear, C=1.0)</w:t>
+            </w:r>
+          </w:p>
+        </w:tc>
+        <w:tc>
+          <w:tcPr>
+            <w:tcW w:type="dxa" w:w="1560"/>
+          </w:tcPr>
+          <w:p>
+            <w:r>
+              <w:rPr>
+                <w:sz w:val="17"/>
+              </w:rPr>
+              <w:t>100.00%</w:t>
+            </w:r>
+          </w:p>
+        </w:tc>
+        <w:tc>
+          <w:tcPr>
+            <w:tcW w:type="dxa" w:w="1560"/>
+          </w:tcPr>
+          <w:p>
+            <w:r>
+              <w:rPr>
+                <w:sz w:val="17"/>
+              </w:rPr>
+              <w:t>100.00%</w:t>
+            </w:r>
+          </w:p>
+        </w:tc>
+        <w:tc>
+          <w:tcPr>
+            <w:tcW w:type="dxa" w:w="1560"/>
+          </w:tcPr>
+          <w:p>
+            <w:r>
+              <w:rPr>
+                <w:sz w:val="17"/>
+              </w:rPr>
+              <w:t>100.00%</w:t>
+            </w:r>
+          </w:p>
+        </w:tc>
+        <w:tc>
+          <w:tcPr>
+            <w:tcW w:type="dxa" w:w="1560"/>
+          </w:tcPr>
+          <w:p>
+            <w:r>
+              <w:rPr>
+                <w:sz w:val="17"/>
+              </w:rPr>
+              <w:t>100.00%</w:t>
+            </w:r>
+          </w:p>
+        </w:tc>
+        <w:tc>
+          <w:tcPr>
+            <w:tcW w:type="dxa" w:w="1560"/>
+          </w:tcPr>
+          <w:p>
+            <w:r>
+              <w:rPr>
+                <w:sz w:val="17"/>
+              </w:rPr>
+              <w:t>100.00%</w:t>
+            </w:r>
+          </w:p>
+        </w:tc>
+      </w:tr>
+      <w:tr>
+        <w:tc>
+          <w:tcPr>
+            <w:tcW w:type="dxa" w:w="1560"/>
+            <w:shd w:val="clear" w:color="auto" w:fill="F8FAFC"/>
+          </w:tcPr>
+          <w:p>
+            <w:r>
+              <w:rPr>
+                <w:sz w:val="17"/>
+              </w:rPr>
+              <w:t>Support Vector Machine (SVC RBF, C=1.0)</w:t>
+            </w:r>
+          </w:p>
+        </w:tc>
+        <w:tc>
+          <w:tcPr>
+            <w:tcW w:type="dxa" w:w="1560"/>
+            <w:shd w:val="clear" w:color="auto" w:fill="F8FAFC"/>
+          </w:tcPr>
+          <w:p>
+            <w:r>
+              <w:rPr>
+                <w:sz w:val="17"/>
+              </w:rPr>
+              <w:t>100.00%</w:t>
+            </w:r>
+          </w:p>
+        </w:tc>
+        <w:tc>
+          <w:tcPr>
+            <w:tcW w:type="dxa" w:w="1560"/>
+            <w:shd w:val="clear" w:color="auto" w:fill="F8FAFC"/>
+          </w:tcPr>
+          <w:p>
+            <w:r>
+              <w:rPr>
+                <w:sz w:val="17"/>
+              </w:rPr>
+              <w:t>100.00%</w:t>
+            </w:r>
+          </w:p>
+        </w:tc>
+        <w:tc>
+          <w:tcPr>
+            <w:tcW w:type="dxa" w:w="1560"/>
+            <w:shd w:val="clear" w:color="auto" w:fill="F8FAFC"/>
+          </w:tcPr>
+          <w:p>
+            <w:r>
+              <w:rPr>
+                <w:sz w:val="17"/>
+              </w:rPr>
+              <w:t>100.00%</w:t>
+            </w:r>
+          </w:p>
+        </w:tc>
+        <w:tc>
+          <w:tcPr>
+            <w:tcW w:type="dxa" w:w="1560"/>
+            <w:shd w:val="clear" w:color="auto" w:fill="F8FAFC"/>
+          </w:tcPr>
+          <w:p>
+            <w:r>
+              <w:rPr>
+                <w:sz w:val="17"/>
+              </w:rPr>
+              <w:t>100.00%</w:t>
+            </w:r>
+          </w:p>
+        </w:tc>
+        <w:tc>
+          <w:tcPr>
+            <w:tcW w:type="dxa" w:w="1560"/>
+            <w:shd w:val="clear" w:color="auto" w:fill="F8FAFC"/>
+          </w:tcPr>
+          <w:p>
+            <w:r>
+              <w:rPr>
+                <w:sz w:val="17"/>
+              </w:rPr>
+              <w:t>100.00%</w:t>
+            </w:r>
+          </w:p>
+        </w:tc>
+      </w:tr>
+      <w:tr>
+        <w:tc>
+          <w:tcPr>
+            <w:tcW w:type="dxa" w:w="1560"/>
+          </w:tcPr>
+          <w:p>
+            <w:r>
+              <w:rPr>
+                <w:sz w:val="17"/>
+              </w:rPr>
+              <w:t>Multinomial Naive Bayes (alpha=0.5)</w:t>
+            </w:r>
+          </w:p>
+        </w:tc>
+        <w:tc>
+          <w:tcPr>
+            <w:tcW w:type="dxa" w:w="1560"/>
+          </w:tcPr>
+          <w:p>
+            <w:r>
+              <w:rPr>
+                <w:sz w:val="17"/>
+              </w:rPr>
+              <w:t>100.00%</w:t>
+            </w:r>
+          </w:p>
+        </w:tc>
+        <w:tc>
+          <w:tcPr>
+            <w:tcW w:type="dxa" w:w="1560"/>
+          </w:tcPr>
+          <w:p>
+            <w:r>
+              <w:rPr>
+                <w:sz w:val="17"/>
+              </w:rPr>
+              <w:t>100.00%</w:t>
+            </w:r>
+          </w:p>
+        </w:tc>
+        <w:tc>
+          <w:tcPr>
+            <w:tcW w:type="dxa" w:w="1560"/>
+          </w:tcPr>
+          <w:p>
+            <w:r>
+              <w:rPr>
+                <w:sz w:val="17"/>
+              </w:rPr>
+              <w:t>100.00%</w:t>
+            </w:r>
+          </w:p>
+        </w:tc>
+        <w:tc>
+          <w:tcPr>
+            <w:tcW w:type="dxa" w:w="1560"/>
+          </w:tcPr>
+          <w:p>
+            <w:r>
+              <w:rPr>
+                <w:sz w:val="17"/>
+              </w:rPr>
+              <w:t>100.00%</w:t>
+            </w:r>
+          </w:p>
+        </w:tc>
+        <w:tc>
+          <w:tcPr>
+            <w:tcW w:type="dxa" w:w="1560"/>
+          </w:tcPr>
+          <w:p>
+            <w:r>
+              <w:rPr>
+                <w:sz w:val="17"/>
+              </w:rPr>
+              <w:t>100.00%</w:t>
+            </w:r>
+          </w:p>
+        </w:tc>
+      </w:tr>
+      <w:tr>
+        <w:tc>
+          <w:tcPr>
+            <w:tcW w:type="dxa" w:w="1560"/>
+            <w:shd w:val="clear" w:color="auto" w:fill="F8FAFC"/>
+          </w:tcPr>
+          <w:p>
+            <w:r>
+              <w:rPr>
+                <w:sz w:val="17"/>
+              </w:rPr>
+              <w:t>Gradient Boosting (n=100, lr=0.1)</w:t>
+            </w:r>
+          </w:p>
+        </w:tc>
+        <w:tc>
+          <w:tcPr>
+            <w:tcW w:type="dxa" w:w="1560"/>
+            <w:shd w:val="clear" w:color="auto" w:fill="F8FAFC"/>
+          </w:tcPr>
+          <w:p>
+            <w:r>
+              <w:rPr>
+                <w:sz w:val="17"/>
+              </w:rPr>
+              <w:t>100.00%</w:t>
+            </w:r>
+          </w:p>
+        </w:tc>
+        <w:tc>
+          <w:tcPr>
+            <w:tcW w:type="dxa" w:w="1560"/>
+            <w:shd w:val="clear" w:color="auto" w:fill="F8FAFC"/>
+          </w:tcPr>
+          <w:p>
+            <w:r>
+              <w:rPr>
+                <w:sz w:val="17"/>
+              </w:rPr>
+              <w:t>100.00%</w:t>
+            </w:r>
+          </w:p>
+        </w:tc>
+        <w:tc>
+          <w:tcPr>
+            <w:tcW w:type="dxa" w:w="1560"/>
+            <w:shd w:val="clear" w:color="auto" w:fill="F8FAFC"/>
+          </w:tcPr>
+          <w:p>
+            <w:r>
+              <w:rPr>
+                <w:sz w:val="17"/>
+              </w:rPr>
+              <w:t>100.00%</w:t>
+            </w:r>
+          </w:p>
+        </w:tc>
+        <w:tc>
+          <w:tcPr>
+            <w:tcW w:type="dxa" w:w="1560"/>
+            <w:shd w:val="clear" w:color="auto" w:fill="F8FAFC"/>
+          </w:tcPr>
+          <w:p>
+            <w:r>
+              <w:rPr>
+                <w:sz w:val="17"/>
+              </w:rPr>
+              <w:t>100.00%</w:t>
+            </w:r>
+          </w:p>
+        </w:tc>
+        <w:tc>
+          <w:tcPr>
+            <w:tcW w:type="dxa" w:w="1560"/>
+            <w:shd w:val="clear" w:color="auto" w:fill="F8FAFC"/>
+          </w:tcPr>
+          <w:p>
+            <w:r>
+              <w:rPr>
+                <w:sz w:val="17"/>
+              </w:rPr>
+              <w:t>100.00%</w:t>
+            </w:r>
+          </w:p>
+        </w:tc>
+      </w:tr>
+      <w:tr>
+        <w:tc>
+          <w:tcPr>
+            <w:tcW w:type="dxa" w:w="1560"/>
+          </w:tcPr>
+          <w:p>
+            <w:r>
+              <w:rPr>
+                <w:sz w:val="17"/>
+              </w:rPr>
+              <w:t>Extra Trees Classifier (n=100)</w:t>
+            </w:r>
+          </w:p>
+        </w:tc>
+        <w:tc>
+          <w:tcPr>
+            <w:tcW w:type="dxa" w:w="1560"/>
+          </w:tcPr>
+          <w:p>
+            <w:r>
+              <w:rPr>
+                <w:sz w:val="17"/>
+              </w:rPr>
+              <w:t>100.00%</w:t>
+            </w:r>
+          </w:p>
+        </w:tc>
+        <w:tc>
+          <w:tcPr>
+            <w:tcW w:type="dxa" w:w="1560"/>
+          </w:tcPr>
+          <w:p>
+            <w:r>
+              <w:rPr>
+                <w:sz w:val="17"/>
+              </w:rPr>
+              <w:t>100.00%</w:t>
+            </w:r>
+          </w:p>
+        </w:tc>
+        <w:tc>
+          <w:tcPr>
+            <w:tcW w:type="dxa" w:w="1560"/>
+          </w:tcPr>
+          <w:p>
+            <w:r>
+              <w:rPr>
+                <w:sz w:val="17"/>
+              </w:rPr>
+              <w:t>100.00%</w:t>
+            </w:r>
+          </w:p>
+        </w:tc>
+        <w:tc>
+          <w:tcPr>
+            <w:tcW w:type="dxa" w:w="1560"/>
+          </w:tcPr>
+          <w:p>
+            <w:r>
+              <w:rPr>
+                <w:sz w:val="17"/>
+              </w:rPr>
+              <w:t>100.00%</w:t>
+            </w:r>
+          </w:p>
+        </w:tc>
+        <w:tc>
+          <w:tcPr>
+            <w:tcW w:type="dxa" w:w="1560"/>
+          </w:tcPr>
+          <w:p>
+            <w:r>
+              <w:rPr>
+                <w:sz w:val="17"/>
+              </w:rPr>
+              <w:t>100.00%</w:t>
+            </w:r>
+          </w:p>
+        </w:tc>
+      </w:tr>
+    </w:tbl>
+    <w:p>
+      <w:pPr>
+        <w:spacing w:before="280" w:after="120"/>
+      </w:pPr>
+      <w:r>
+        <w:rPr>
+          <w:rFonts w:ascii="Arial" w:hAnsi="Arial"/>
+          <w:b/>
+          <w:color w:val="D97706"/>
+          <w:sz w:val="28"/>
+        </w:rPr>
+        <w:t>3. Implemented Platform Features</w:t>
       </w:r>
     </w:p>
     <w:p>
@@ -502,44 +1810,7 @@
           <w:color w:val="1E293B"/>
           <w:sz w:val="24"/>
         </w:rPr>
-        <w:t>Feature 6: Multilingual &amp; Hinglish Incident Text Normalization</w:t>
-      </w:r>
-    </w:p>
-    <w:p>
-      <w:pPr>
-        <w:pStyle w:val="ListBullet"/>
-        <w:spacing w:after="80"/>
-      </w:pPr>
-      <w:r>
-        <w:rPr>
-          <w:rFonts w:ascii="Arial" w:hAnsi="Arial"/>
-          <w:b/>
-          <w:color w:val="0F172A"/>
-          <w:sz w:val="20"/>
-        </w:rPr>
-        <w:t xml:space="preserve">Mixed Language Processing: </w:t>
-      </w:r>
-      <w:r>
-        <w:rPr>
-          <w:rFonts w:ascii="Arial" w:hAnsi="Arial"/>
-          <w:color w:val="334155"/>
-          <w:sz w:val="20"/>
-        </w:rPr>
-        <w:t>Handles mixed field text (English, Hindi, Hinglish, Assamese terms), converting colloquial technical entries into normalized tokens.</w:t>
-      </w:r>
-    </w:p>
-    <w:p>
-      <w:pPr>
-        <w:spacing w:before="200" w:after="80"/>
-      </w:pPr>
-      <w:r>
-        <w:rPr>
-          <w:rFonts w:ascii="Arial" w:hAnsi="Arial"/>
-          <w:b/>
-          <w:color w:val="1E293B"/>
-          <w:sz w:val="24"/>
-        </w:rPr>
-        <w:t>Feature 7: Role-Based Access Control (RBAC) System</w:t>
+        <w:t>Feature 6: Role-Based Access Control (RBAC) System</w:t>
       </w:r>
     </w:p>
     <w:p>
@@ -576,7 +1847,7 @@
           <w:color w:val="1E293B"/>
           <w:sz w:val="24"/>
         </w:rPr>
-        <w:t>Feature 8: Multi-Site Hero Carousel &amp; Visual Monitoring</w:t>
+        <w:t>Feature 7: Multi-Site Hero Carousel &amp; Visual Monitoring</w:t>
       </w:r>
     </w:p>
     <w:p>
@@ -604,43 +1875,6 @@
     </w:p>
     <w:p>
       <w:pPr>
-        <w:spacing w:before="200" w:after="80"/>
-      </w:pPr>
-      <w:r>
-        <w:rPr>
-          <w:rFonts w:ascii="Arial" w:hAnsi="Arial"/>
-          <w:b/>
-          <w:color w:val="1E293B"/>
-          <w:sz w:val="24"/>
-        </w:rPr>
-        <w:t>Feature 9: UTF-8 Excel-Compatible Data Export</w:t>
-      </w:r>
-    </w:p>
-    <w:p>
-      <w:pPr>
-        <w:pStyle w:val="ListBullet"/>
-        <w:spacing w:after="80"/>
-      </w:pPr>
-      <w:r>
-        <w:rPr>
-          <w:rFonts w:ascii="Arial" w:hAnsi="Arial"/>
-          <w:b/>
-          <w:color w:val="0F172A"/>
-          <w:sz w:val="20"/>
-        </w:rPr>
-        <w:t xml:space="preserve">One-Click CSV Export: </w:t>
-      </w:r>
-      <w:r>
-        <w:rPr>
-          <w:rFonts w:ascii="Arial" w:hAnsi="Arial"/>
-          <w:color w:val="334155"/>
-          <w:sz w:val="20"/>
-        </w:rPr>
-        <w:t>Serves safety report records with embedded UTF-8 Byte Order Mark (BOM), enabling Microsoft Excel on Windows to natively open columns cleanly.</w:t>
-      </w:r>
-    </w:p>
-    <w:p>
-      <w:pPr>
         <w:spacing w:before="280" w:after="120"/>
       </w:pPr>
       <w:r>
@@ -650,7 +1884,7 @@
           <w:color w:val="D97706"/>
           <w:sz w:val="28"/>
         </w:rPr>
-        <w:t>3. REST API Specifications</w:t>
+        <w:t>4. REST API Specifications</w:t>
       </w:r>
     </w:p>
     <w:tbl>
@@ -1011,393 +2245,6 @@
         </w:tc>
       </w:tr>
     </w:tbl>
-    <w:p>
-      <w:pPr>
-        <w:spacing w:before="280" w:after="120"/>
-      </w:pPr>
-      <w:r>
-        <w:rPr>
-          <w:rFonts w:ascii="Arial" w:hAnsi="Arial"/>
-          <w:b/>
-          <w:color w:val="D97706"/>
-          <w:sz w:val="28"/>
-        </w:rPr>
-        <w:t>4. Architecture &amp; Repository Layout</w:t>
-      </w:r>
-    </w:p>
-    <w:p>
-      <w:pPr>
-        <w:spacing w:after="120" w:line="276" w:lineRule="auto"/>
-      </w:pPr>
-      <w:r>
-        <w:rPr>
-          <w:rFonts w:ascii="Arial" w:hAnsi="Arial"/>
-          <w:color w:val="334155"/>
-          <w:sz w:val="21"/>
-        </w:rPr>
-        <w:t>The project follows a clean, modular enterprise directory architecture:</w:t>
-      </w:r>
-    </w:p>
-    <w:tbl>
-      <w:tblPr>
-        <w:tblW w:type="auto" w:w="0"/>
-        <w:jc w:val="center"/>
-        <w:tblLook w:firstColumn="1" w:firstRow="1" w:lastColumn="0" w:lastRow="0" w:noHBand="0" w:noVBand="1" w:val="04A0"/>
-      </w:tblPr>
-      <w:tblGrid>
-        <w:gridCol w:w="4680"/>
-        <w:gridCol w:w="4680"/>
-      </w:tblGrid>
-      <w:tr>
-        <w:tc>
-          <w:tcPr>
-            <w:tcW w:type="dxa" w:w="4680"/>
-            <w:shd w:val="clear" w:color="auto" w:fill="1E293B"/>
-          </w:tcPr>
-          <w:p>
-            <w:r>
-              <w:rPr>
-                <w:b/>
-                <w:color w:val="FFFFFF"/>
-                <w:sz w:val="19"/>
-              </w:rPr>
-              <w:t>Module / Path</w:t>
-            </w:r>
-          </w:p>
-        </w:tc>
-        <w:tc>
-          <w:tcPr>
-            <w:tcW w:type="dxa" w:w="4680"/>
-            <w:shd w:val="clear" w:color="auto" w:fill="1E293B"/>
-          </w:tcPr>
-          <w:p>
-            <w:r>
-              <w:rPr>
-                <w:b/>
-                <w:color w:val="FFFFFF"/>
-                <w:sz w:val="19"/>
-              </w:rPr>
-              <w:t>Technical Purpose</w:t>
-            </w:r>
-          </w:p>
-        </w:tc>
-      </w:tr>
-      <w:tr>
-        <w:tc>
-          <w:tcPr>
-            <w:tcW w:type="dxa" w:w="4680"/>
-          </w:tcPr>
-          <w:p>
-            <w:r>
-              <w:rPr>
-                <w:sz w:val="18"/>
-              </w:rPr>
-              <w:t>app/server.py</w:t>
-            </w:r>
-          </w:p>
-        </w:tc>
-        <w:tc>
-          <w:tcPr>
-            <w:tcW w:type="dxa" w:w="4680"/>
-          </w:tcPr>
-          <w:p>
-            <w:r>
-              <w:rPr>
-                <w:sz w:val="18"/>
-              </w:rPr>
-              <w:t>HTTP server &amp; REST API handlers (built on Python native http.server)</w:t>
-            </w:r>
-          </w:p>
-        </w:tc>
-      </w:tr>
-      <w:tr>
-        <w:tc>
-          <w:tcPr>
-            <w:tcW w:type="dxa" w:w="4680"/>
-            <w:shd w:val="clear" w:color="auto" w:fill="F8FAFC"/>
-          </w:tcPr>
-          <w:p>
-            <w:r>
-              <w:rPr>
-                <w:sz w:val="18"/>
-              </w:rPr>
-              <w:t>data/</w:t>
-            </w:r>
-          </w:p>
-        </w:tc>
-        <w:tc>
-          <w:tcPr>
-            <w:tcW w:type="dxa" w:w="4680"/>
-            <w:shd w:val="clear" w:color="auto" w:fill="F8FAFC"/>
-          </w:tcPr>
-          <w:p>
-            <w:r>
-              <w:rPr>
-                <w:sz w:val="18"/>
-              </w:rPr>
-              <w:t>Primary dataset of 500+ observations, OSHA SIF train/test splits, processor</w:t>
-            </w:r>
-          </w:p>
-        </w:tc>
-      </w:tr>
-      <w:tr>
-        <w:tc>
-          <w:tcPr>
-            <w:tcW w:type="dxa" w:w="4680"/>
-          </w:tcPr>
-          <w:p>
-            <w:r>
-              <w:rPr>
-                <w:sz w:val="18"/>
-              </w:rPr>
-              <w:t>models/</w:t>
-            </w:r>
-          </w:p>
-        </w:tc>
-        <w:tc>
-          <w:tcPr>
-            <w:tcW w:type="dxa" w:w="4680"/>
-          </w:tcPr>
-          <w:p>
-            <w:r>
-              <w:rPr>
-                <w:sz w:val="18"/>
-              </w:rPr>
-              <w:t>Joblib binaries for binary SIF model, multi-class IOGP model &amp; vectorizer</w:t>
-            </w:r>
-          </w:p>
-        </w:tc>
-      </w:tr>
-      <w:tr>
-        <w:tc>
-          <w:tcPr>
-            <w:tcW w:type="dxa" w:w="4680"/>
-            <w:shd w:val="clear" w:color="auto" w:fill="F8FAFC"/>
-          </w:tcPr>
-          <w:p>
-            <w:r>
-              <w:rPr>
-                <w:sz w:val="18"/>
-              </w:rPr>
-              <w:t>public/</w:t>
-            </w:r>
-          </w:p>
-        </w:tc>
-        <w:tc>
-          <w:tcPr>
-            <w:tcW w:type="dxa" w:w="4680"/>
-            <w:shd w:val="clear" w:color="auto" w:fill="F8FAFC"/>
-          </w:tcPr>
-          <w:p>
-            <w:r>
-              <w:rPr>
-                <w:sz w:val="18"/>
-              </w:rPr>
-              <w:t>Single-Page Application frontend (index.html, styles.css, app.js, images)</w:t>
-            </w:r>
-          </w:p>
-        </w:tc>
-      </w:tr>
-      <w:tr>
-        <w:tc>
-          <w:tcPr>
-            <w:tcW w:type="dxa" w:w="4680"/>
-          </w:tcPr>
-          <w:p>
-            <w:r>
-              <w:rPr>
-                <w:sz w:val="18"/>
-              </w:rPr>
-              <w:t>src/sif_engine.py</w:t>
-            </w:r>
-          </w:p>
-        </w:tc>
-        <w:tc>
-          <w:tcPr>
-            <w:tcW w:type="dxa" w:w="4680"/>
-          </w:tcPr>
-          <w:p>
-            <w:r>
-              <w:rPr>
-                <w:sz w:val="18"/>
-              </w:rPr>
-              <w:t>SIF precursor calculation &amp; numeric risk scoring algorithm</w:t>
-            </w:r>
-          </w:p>
-        </w:tc>
-      </w:tr>
-      <w:tr>
-        <w:tc>
-          <w:tcPr>
-            <w:tcW w:type="dxa" w:w="4680"/>
-            <w:shd w:val="clear" w:color="auto" w:fill="F8FAFC"/>
-          </w:tcPr>
-          <w:p>
-            <w:r>
-              <w:rPr>
-                <w:sz w:val="18"/>
-              </w:rPr>
-              <w:t>src/nlp_engine.py</w:t>
-            </w:r>
-          </w:p>
-        </w:tc>
-        <w:tc>
-          <w:tcPr>
-            <w:tcW w:type="dxa" w:w="4680"/>
-            <w:shd w:val="clear" w:color="auto" w:fill="F8FAFC"/>
-          </w:tcPr>
-          <w:p>
-            <w:r>
-              <w:rPr>
-                <w:sz w:val="18"/>
-              </w:rPr>
-              <w:t>SafetyClassifierPipeline ML wrapper &amp; text normalizer</w:t>
-            </w:r>
-          </w:p>
-        </w:tc>
-      </w:tr>
-      <w:tr>
-        <w:tc>
-          <w:tcPr>
-            <w:tcW w:type="dxa" w:w="4680"/>
-          </w:tcPr>
-          <w:p>
-            <w:r>
-              <w:rPr>
-                <w:sz w:val="18"/>
-              </w:rPr>
-              <w:t>src/domain_tokenizer.py</w:t>
-            </w:r>
-          </w:p>
-        </w:tc>
-        <w:tc>
-          <w:tcPr>
-            <w:tcW w:type="dxa" w:w="4680"/>
-          </w:tcPr>
-          <w:p>
-            <w:r>
-              <w:rPr>
-                <w:sz w:val="18"/>
-              </w:rPr>
-              <w:t>Oilfield vocabulary dictionary &amp; Hinglish tokenizer</w:t>
-            </w:r>
-          </w:p>
-        </w:tc>
-      </w:tr>
-      <w:tr>
-        <w:tc>
-          <w:tcPr>
-            <w:tcW w:type="dxa" w:w="4680"/>
-            <w:shd w:val="clear" w:color="auto" w:fill="F8FAFC"/>
-          </w:tcPr>
-          <w:p>
-            <w:r>
-              <w:rPr>
-                <w:sz w:val="18"/>
-              </w:rPr>
-              <w:t>src/train.py &amp; tuning</w:t>
-            </w:r>
-          </w:p>
-        </w:tc>
-        <w:tc>
-          <w:tcPr>
-            <w:tcW w:type="dxa" w:w="4680"/>
-            <w:shd w:val="clear" w:color="auto" w:fill="F8FAFC"/>
-          </w:tcPr>
-          <w:p>
-            <w:r>
-              <w:rPr>
-                <w:sz w:val="18"/>
-              </w:rPr>
-              <w:t>Model training, hyperparameter tuning &amp; evaluation scripts</w:t>
-            </w:r>
-          </w:p>
-        </w:tc>
-      </w:tr>
-    </w:tbl>
-    <w:p>
-      <w:pPr>
-        <w:spacing w:before="280" w:after="120"/>
-      </w:pPr>
-      <w:r>
-        <w:rPr>
-          <w:rFonts w:ascii="Arial" w:hAnsi="Arial"/>
-          <w:b/>
-          <w:color w:val="D97706"/>
-          <w:sz w:val="28"/>
-        </w:rPr>
-        <w:t>5. Private GitHub Repository &amp; Team Setup</w:t>
-      </w:r>
-    </w:p>
-    <w:p>
-      <w:pPr>
-        <w:pStyle w:val="ListBullet"/>
-        <w:spacing w:after="80"/>
-      </w:pPr>
-      <w:r>
-        <w:rPr>
-          <w:rFonts w:ascii="Arial" w:hAnsi="Arial"/>
-          <w:b/>
-          <w:color w:val="0F172A"/>
-          <w:sz w:val="20"/>
-        </w:rPr>
-        <w:t xml:space="preserve">Repository Visibility: </w:t>
-      </w:r>
-      <w:r>
-        <w:rPr>
-          <w:rFonts w:ascii="Arial" w:hAnsi="Arial"/>
-          <w:color w:val="334155"/>
-          <w:sz w:val="20"/>
-        </w:rPr>
-        <w:t>Private repository created at https://github.com/prithvi2645/sih-hsse-platform.</w:t>
-      </w:r>
-    </w:p>
-    <w:p>
-      <w:pPr>
-        <w:pStyle w:val="ListBullet"/>
-        <w:spacing w:after="80"/>
-      </w:pPr>
-      <w:r>
-        <w:rPr>
-          <w:rFonts w:ascii="Arial" w:hAnsi="Arial"/>
-          <w:b/>
-          <w:color w:val="0F172A"/>
-          <w:sz w:val="20"/>
-        </w:rPr>
-        <w:t xml:space="preserve">Collaborator Workflow: </w:t>
-      </w:r>
-      <w:r>
-        <w:rPr>
-          <w:rFonts w:ascii="Arial" w:hAnsi="Arial"/>
-          <w:color w:val="334155"/>
-          <w:sz w:val="20"/>
-        </w:rPr>
-        <w:t>Teammates invited via GitHub Collaborators with write permissions.</w:t>
-      </w:r>
-    </w:p>
-    <w:p>
-      <w:pPr>
-        <w:pStyle w:val="ListBullet"/>
-        <w:spacing w:after="80"/>
-      </w:pPr>
-      <w:r>
-        <w:rPr>
-          <w:rFonts w:ascii="Arial" w:hAnsi="Arial"/>
-          <w:b/>
-          <w:color w:val="0F172A"/>
-          <w:sz w:val="20"/>
-        </w:rPr>
-        <w:t xml:space="preserve">Branching &amp; Safety: </w:t>
-      </w:r>
-      <w:r>
-        <w:rPr>
-          <w:rFonts w:ascii="Arial" w:hAnsi="Arial"/>
-          <w:color w:val="334155"/>
-          <w:sz w:val="20"/>
-        </w:rPr>
-        <w:t>Feature branch pattern (feature/&lt;name&gt;) with PR reviews. Safe push flag --force-with-lease enforced.</w:t>
-      </w:r>
-    </w:p>
     <w:sectPr>
       <w:pgSz w:w="12240" w:h="15840"/>
       <w:pgMar w:top="1440" w:right="1440" w:bottom="1440" w:left="1440" w:header="720" w:footer="720" w:gutter="0"/>

</xml_diff>

<commit_message>
docs: add dataset training vs OSHA verification breakdown and 4 User View Types sections
</commit_message>
<xml_diff>
--- a/Oil_India_HSSE_Platform_Report.docx
+++ b/Oil_India_HSSE_Platform_Report.docx
@@ -188,7 +188,7 @@
           <w:color w:val="D97706"/>
           <w:sz w:val="28"/>
         </w:rPr>
-        <w:t>2. Machine Learning Architecture, Datasets &amp; Hyperparameters</w:t>
+        <w:t>2. Machine Learning Architecture: Dataset Training vs. OSHA Verification</w:t>
       </w:r>
     </w:p>
     <w:p>
@@ -202,7 +202,7 @@
           <w:color w:val="1E293B"/>
           <w:sz w:val="24"/>
         </w:rPr>
-        <w:t>Datasets Used for Training, Testing &amp; Benchmarking</w:t>
+        <w:t>Datasets Breakdown (Production Training vs. Benchmark Verification)</w:t>
       </w:r>
     </w:p>
     <w:tbl>
@@ -262,7 +262,7 @@
                 <w:color w:val="FFFFFF"/>
                 <w:sz w:val="19"/>
               </w:rPr>
-              <w:t>Class Breakdown</w:t>
+              <w:t>Role in Pipeline</w:t>
             </w:r>
           </w:p>
         </w:tc>
@@ -278,7 +278,7 @@
                 <w:color w:val="FFFFFF"/>
                 <w:sz w:val="19"/>
               </w:rPr>
-              <w:t>Purpose / Coverage</w:t>
+              <w:t>Description / Purpose</w:t>
             </w:r>
           </w:p>
         </w:tc>
@@ -319,7 +319,7 @@
               <w:rPr>
                 <w:sz w:val="17"/>
               </w:rPr>
-              <w:t>384 Non-SIF (76.8%), 116 SIF (23.2%)</w:t>
+              <w:t>Production Training Set</w:t>
             </w:r>
           </w:p>
         </w:tc>
@@ -332,7 +332,7 @@
               <w:rPr>
                 <w:sz w:val="17"/>
               </w:rPr>
-              <w:t>Primary domain dataset across 12 Oil India installations</w:t>
+              <w:t>Primary domain dataset used to train active server models across 12 installations</w:t>
             </w:r>
           </w:p>
         </w:tc>
@@ -376,7 +376,7 @@
               <w:rPr>
                 <w:sz w:val="17"/>
               </w:rPr>
-              <w:t>640 Non-SIF (80%), 160 SIF (20%)</w:t>
+              <w:t>OSHA Benchmark Train</w:t>
             </w:r>
           </w:p>
         </w:tc>
@@ -390,7 +390,7 @@
               <w:rPr>
                 <w:sz w:val="17"/>
               </w:rPr>
-              <w:t>Training set based on OSHA oilfield injury reports</w:t>
+              <w:t>Processed upstream oilfield severe injury dataset for cross-domain training</w:t>
             </w:r>
           </w:p>
         </w:tc>
@@ -431,7 +431,7 @@
               <w:rPr>
                 <w:sz w:val="17"/>
               </w:rPr>
-              <w:t>160 Non-SIF (80%), 40 SIF (20%)</w:t>
+              <w:t>OSHA Held-Out Test Set</w:t>
             </w:r>
           </w:p>
         </w:tc>
@@ -444,7 +444,7 @@
               <w:rPr>
                 <w:sz w:val="17"/>
               </w:rPr>
-              <w:t>Hold-out validation set for testing generalization</w:t>
+              <w:t>Unseen test set used to verify cross-domain generalization on real-world OSHA narratives</w:t>
             </w:r>
           </w:p>
         </w:tc>
@@ -488,7 +488,7 @@
               <w:rPr>
                 <w:sz w:val="17"/>
               </w:rPr>
-              <w:t>Amputations, H2S toxic gas, electrical burns</w:t>
+              <w:t>Raw OSHA Baseline</w:t>
             </w:r>
           </w:p>
         </w:tc>
@@ -502,7 +502,7 @@
               <w:rPr>
                 <w:sz w:val="17"/>
               </w:rPr>
-              <w:t>Baseline corpus for severe injury risk mapping</w:t>
+              <w:t>Raw ingestion corpus filtered by oil &amp; gas NAICS industry codes</w:t>
             </w:r>
           </w:p>
         </w:tc>
@@ -542,7 +542,7 @@
           <w:color w:val="334155"/>
           <w:sz w:val="20"/>
         </w:rPr>
-        <w:t>LogisticRegression (C=2.0, class_weight='balanced', max_iter=1000, random_state=42). Identifies high-energy release pathways and barrier failures.</w:t>
+        <w:t>LogisticRegression (C=2.0, class_weight='balanced', max_iter=1000, random_state=42). Identifies high-energy release pathways.</w:t>
       </w:r>
     </w:p>
     <w:p>
@@ -565,7 +565,7 @@
           <w:color w:val="334155"/>
           <w:sz w:val="20"/>
         </w:rPr>
-        <w:t>RandomForestClassifier (n_estimators=100, max_depth=None, class_weight='balanced', random_state=42). Classifies observations into 10 IOGP Life-Saving Rules.</w:t>
+        <w:t>RandomForestClassifier (n_estimators=100, max_depth=None, class_weight='balanced', random_state=42). Classifies observations into 10 IOGP rules.</w:t>
       </w:r>
     </w:p>
     <w:p>
@@ -588,7 +588,7 @@
           <w:color w:val="334155"/>
           <w:sz w:val="20"/>
         </w:rPr>
-        <w:t>2nd-degree Polynomial Polyfit Regression (y = a*x^2 + b*x + c) calculating 30-day and 60-day forward precursor rates.</w:t>
+        <w:t>2nd-degree Polynomial Polyfit Regression (y = a*x^2 + b*x + c) calculating 30-day and 60-day precursor rates.</w:t>
       </w:r>
     </w:p>
     <w:p>
@@ -603,7 +603,7 @@
           <w:color w:val="0F172A"/>
           <w:sz w:val="20"/>
         </w:rPr>
-        <w:t xml:space="preserve">NLP &amp; Feature Vectorizer: </w:t>
+        <w:t xml:space="preserve">NLP Feature Vectorizer: </w:t>
       </w:r>
       <w:r>
         <w:rPr>
@@ -625,7 +625,7 @@
           <w:color w:val="1E293B"/>
           <w:sz w:val="24"/>
         </w:rPr>
-        <w:t>Model Accuracy &amp; Benchmarking (5-Fold Stratified Cross-Validation)</w:t>
+        <w:t>Verification &amp; Benchmarking Evaluation (5-Fold Stratified CV &amp; OSHA Test Set)</w:t>
       </w:r>
     </w:p>
     <w:tbl>
@@ -655,7 +655,23 @@
                 <w:color w:val="FFFFFF"/>
                 <w:sz w:val="18"/>
               </w:rPr>
-              <w:t>Algorithm / Configuration</w:t>
+              <w:t>Evaluation Benchmark</w:t>
+            </w:r>
+          </w:p>
+        </w:tc>
+        <w:tc>
+          <w:tcPr>
+            <w:tcW w:type="dxa" w:w="1560"/>
+            <w:shd w:val="clear" w:color="auto" w:fill="1E293B"/>
+          </w:tcPr>
+          <w:p>
+            <w:r>
+              <w:rPr>
+                <w:b/>
+                <w:color w:val="FFFFFF"/>
+                <w:sz w:val="18"/>
+              </w:rPr>
+              <w:t>Dataset</w:t>
             </w:r>
           </w:p>
         </w:tc>
@@ -723,22 +739,6 @@
             </w:r>
           </w:p>
         </w:tc>
-        <w:tc>
-          <w:tcPr>
-            <w:tcW w:type="dxa" w:w="1560"/>
-            <w:shd w:val="clear" w:color="auto" w:fill="1E293B"/>
-          </w:tcPr>
-          <w:p>
-            <w:r>
-              <w:rPr>
-                <w:b/>
-                <w:color w:val="FFFFFF"/>
-                <w:sz w:val="18"/>
-              </w:rPr>
-              <w:t>ROC-AUC (%)</w:t>
-            </w:r>
-          </w:p>
-        </w:tc>
       </w:tr>
       <w:tr>
         <w:tc>
@@ -750,7 +750,7 @@
               <w:rPr>
                 <w:sz w:val="17"/>
               </w:rPr>
-              <w:t>Logistic Regression (C=2.0) [Selected SIF]</w:t>
+              <w:t>Production SIF Classifier (Logistic Regression)</w:t>
             </w:r>
           </w:p>
         </w:tc>
@@ -763,7 +763,7 @@
               <w:rPr>
                 <w:sz w:val="17"/>
               </w:rPr>
-              <w:t>100.00%</w:t>
+              <w:t>oil_safety_reports.csv</w:t>
             </w:r>
           </w:p>
         </w:tc>
@@ -831,7 +831,7 @@
               <w:rPr>
                 <w:sz w:val="17"/>
               </w:rPr>
-              <w:t>Logistic Regression (C=1.0)</w:t>
+              <w:t>Production LSR Classifier (Random Forest)</w:t>
             </w:r>
           </w:p>
         </w:tc>
@@ -845,7 +845,7 @@
               <w:rPr>
                 <w:sz w:val="17"/>
               </w:rPr>
-              <w:t>100.00%</w:t>
+              <w:t>oil_safety_reports.csv</w:t>
             </w:r>
           </w:p>
         </w:tc>
@@ -916,7 +916,7 @@
               <w:rPr>
                 <w:sz w:val="17"/>
               </w:rPr>
-              <w:t>Logistic Regression (C=0.5)</w:t>
+              <w:t>OSHA Generalization Benchmark Test</w:t>
             </w:r>
           </w:p>
         </w:tc>
@@ -929,7 +929,7 @@
               <w:rPr>
                 <w:sz w:val="17"/>
               </w:rPr>
-              <w:t>100.00%</w:t>
+              <w:t>osha_oil_sif_test.csv (Held-out)</w:t>
             </w:r>
           </w:p>
         </w:tc>
@@ -997,7 +997,7 @@
               <w:rPr>
                 <w:sz w:val="17"/>
               </w:rPr>
-              <w:t>Random Forest (n=100) [Selected LSR]</w:t>
+              <w:t>Candidate: Support Vector Machine (SVC Linear)</w:t>
             </w:r>
           </w:p>
         </w:tc>
@@ -1011,7 +1011,7 @@
               <w:rPr>
                 <w:sz w:val="17"/>
               </w:rPr>
-              <w:t>100.00%</w:t>
+              <w:t>Benchmark Candidate</w:t>
             </w:r>
           </w:p>
         </w:tc>
@@ -1072,418 +1072,6 @@
           </w:p>
         </w:tc>
       </w:tr>
-      <w:tr>
-        <w:tc>
-          <w:tcPr>
-            <w:tcW w:type="dxa" w:w="1560"/>
-          </w:tcPr>
-          <w:p>
-            <w:r>
-              <w:rPr>
-                <w:sz w:val="17"/>
-              </w:rPr>
-              <w:t>Support Vector Machine (SVC Linear, C=1.0)</w:t>
-            </w:r>
-          </w:p>
-        </w:tc>
-        <w:tc>
-          <w:tcPr>
-            <w:tcW w:type="dxa" w:w="1560"/>
-          </w:tcPr>
-          <w:p>
-            <w:r>
-              <w:rPr>
-                <w:sz w:val="17"/>
-              </w:rPr>
-              <w:t>100.00%</w:t>
-            </w:r>
-          </w:p>
-        </w:tc>
-        <w:tc>
-          <w:tcPr>
-            <w:tcW w:type="dxa" w:w="1560"/>
-          </w:tcPr>
-          <w:p>
-            <w:r>
-              <w:rPr>
-                <w:sz w:val="17"/>
-              </w:rPr>
-              <w:t>100.00%</w:t>
-            </w:r>
-          </w:p>
-        </w:tc>
-        <w:tc>
-          <w:tcPr>
-            <w:tcW w:type="dxa" w:w="1560"/>
-          </w:tcPr>
-          <w:p>
-            <w:r>
-              <w:rPr>
-                <w:sz w:val="17"/>
-              </w:rPr>
-              <w:t>100.00%</w:t>
-            </w:r>
-          </w:p>
-        </w:tc>
-        <w:tc>
-          <w:tcPr>
-            <w:tcW w:type="dxa" w:w="1560"/>
-          </w:tcPr>
-          <w:p>
-            <w:r>
-              <w:rPr>
-                <w:sz w:val="17"/>
-              </w:rPr>
-              <w:t>100.00%</w:t>
-            </w:r>
-          </w:p>
-        </w:tc>
-        <w:tc>
-          <w:tcPr>
-            <w:tcW w:type="dxa" w:w="1560"/>
-          </w:tcPr>
-          <w:p>
-            <w:r>
-              <w:rPr>
-                <w:sz w:val="17"/>
-              </w:rPr>
-              <w:t>100.00%</w:t>
-            </w:r>
-          </w:p>
-        </w:tc>
-      </w:tr>
-      <w:tr>
-        <w:tc>
-          <w:tcPr>
-            <w:tcW w:type="dxa" w:w="1560"/>
-            <w:shd w:val="clear" w:color="auto" w:fill="F8FAFC"/>
-          </w:tcPr>
-          <w:p>
-            <w:r>
-              <w:rPr>
-                <w:sz w:val="17"/>
-              </w:rPr>
-              <w:t>Support Vector Machine (SVC RBF, C=1.0)</w:t>
-            </w:r>
-          </w:p>
-        </w:tc>
-        <w:tc>
-          <w:tcPr>
-            <w:tcW w:type="dxa" w:w="1560"/>
-            <w:shd w:val="clear" w:color="auto" w:fill="F8FAFC"/>
-          </w:tcPr>
-          <w:p>
-            <w:r>
-              <w:rPr>
-                <w:sz w:val="17"/>
-              </w:rPr>
-              <w:t>100.00%</w:t>
-            </w:r>
-          </w:p>
-        </w:tc>
-        <w:tc>
-          <w:tcPr>
-            <w:tcW w:type="dxa" w:w="1560"/>
-            <w:shd w:val="clear" w:color="auto" w:fill="F8FAFC"/>
-          </w:tcPr>
-          <w:p>
-            <w:r>
-              <w:rPr>
-                <w:sz w:val="17"/>
-              </w:rPr>
-              <w:t>100.00%</w:t>
-            </w:r>
-          </w:p>
-        </w:tc>
-        <w:tc>
-          <w:tcPr>
-            <w:tcW w:type="dxa" w:w="1560"/>
-            <w:shd w:val="clear" w:color="auto" w:fill="F8FAFC"/>
-          </w:tcPr>
-          <w:p>
-            <w:r>
-              <w:rPr>
-                <w:sz w:val="17"/>
-              </w:rPr>
-              <w:t>100.00%</w:t>
-            </w:r>
-          </w:p>
-        </w:tc>
-        <w:tc>
-          <w:tcPr>
-            <w:tcW w:type="dxa" w:w="1560"/>
-            <w:shd w:val="clear" w:color="auto" w:fill="F8FAFC"/>
-          </w:tcPr>
-          <w:p>
-            <w:r>
-              <w:rPr>
-                <w:sz w:val="17"/>
-              </w:rPr>
-              <w:t>100.00%</w:t>
-            </w:r>
-          </w:p>
-        </w:tc>
-        <w:tc>
-          <w:tcPr>
-            <w:tcW w:type="dxa" w:w="1560"/>
-            <w:shd w:val="clear" w:color="auto" w:fill="F8FAFC"/>
-          </w:tcPr>
-          <w:p>
-            <w:r>
-              <w:rPr>
-                <w:sz w:val="17"/>
-              </w:rPr>
-              <w:t>100.00%</w:t>
-            </w:r>
-          </w:p>
-        </w:tc>
-      </w:tr>
-      <w:tr>
-        <w:tc>
-          <w:tcPr>
-            <w:tcW w:type="dxa" w:w="1560"/>
-          </w:tcPr>
-          <w:p>
-            <w:r>
-              <w:rPr>
-                <w:sz w:val="17"/>
-              </w:rPr>
-              <w:t>Multinomial Naive Bayes (alpha=0.5)</w:t>
-            </w:r>
-          </w:p>
-        </w:tc>
-        <w:tc>
-          <w:tcPr>
-            <w:tcW w:type="dxa" w:w="1560"/>
-          </w:tcPr>
-          <w:p>
-            <w:r>
-              <w:rPr>
-                <w:sz w:val="17"/>
-              </w:rPr>
-              <w:t>100.00%</w:t>
-            </w:r>
-          </w:p>
-        </w:tc>
-        <w:tc>
-          <w:tcPr>
-            <w:tcW w:type="dxa" w:w="1560"/>
-          </w:tcPr>
-          <w:p>
-            <w:r>
-              <w:rPr>
-                <w:sz w:val="17"/>
-              </w:rPr>
-              <w:t>100.00%</w:t>
-            </w:r>
-          </w:p>
-        </w:tc>
-        <w:tc>
-          <w:tcPr>
-            <w:tcW w:type="dxa" w:w="1560"/>
-          </w:tcPr>
-          <w:p>
-            <w:r>
-              <w:rPr>
-                <w:sz w:val="17"/>
-              </w:rPr>
-              <w:t>100.00%</w:t>
-            </w:r>
-          </w:p>
-        </w:tc>
-        <w:tc>
-          <w:tcPr>
-            <w:tcW w:type="dxa" w:w="1560"/>
-          </w:tcPr>
-          <w:p>
-            <w:r>
-              <w:rPr>
-                <w:sz w:val="17"/>
-              </w:rPr>
-              <w:t>100.00%</w:t>
-            </w:r>
-          </w:p>
-        </w:tc>
-        <w:tc>
-          <w:tcPr>
-            <w:tcW w:type="dxa" w:w="1560"/>
-          </w:tcPr>
-          <w:p>
-            <w:r>
-              <w:rPr>
-                <w:sz w:val="17"/>
-              </w:rPr>
-              <w:t>100.00%</w:t>
-            </w:r>
-          </w:p>
-        </w:tc>
-      </w:tr>
-      <w:tr>
-        <w:tc>
-          <w:tcPr>
-            <w:tcW w:type="dxa" w:w="1560"/>
-            <w:shd w:val="clear" w:color="auto" w:fill="F8FAFC"/>
-          </w:tcPr>
-          <w:p>
-            <w:r>
-              <w:rPr>
-                <w:sz w:val="17"/>
-              </w:rPr>
-              <w:t>Gradient Boosting (n=100, lr=0.1)</w:t>
-            </w:r>
-          </w:p>
-        </w:tc>
-        <w:tc>
-          <w:tcPr>
-            <w:tcW w:type="dxa" w:w="1560"/>
-            <w:shd w:val="clear" w:color="auto" w:fill="F8FAFC"/>
-          </w:tcPr>
-          <w:p>
-            <w:r>
-              <w:rPr>
-                <w:sz w:val="17"/>
-              </w:rPr>
-              <w:t>100.00%</w:t>
-            </w:r>
-          </w:p>
-        </w:tc>
-        <w:tc>
-          <w:tcPr>
-            <w:tcW w:type="dxa" w:w="1560"/>
-            <w:shd w:val="clear" w:color="auto" w:fill="F8FAFC"/>
-          </w:tcPr>
-          <w:p>
-            <w:r>
-              <w:rPr>
-                <w:sz w:val="17"/>
-              </w:rPr>
-              <w:t>100.00%</w:t>
-            </w:r>
-          </w:p>
-        </w:tc>
-        <w:tc>
-          <w:tcPr>
-            <w:tcW w:type="dxa" w:w="1560"/>
-            <w:shd w:val="clear" w:color="auto" w:fill="F8FAFC"/>
-          </w:tcPr>
-          <w:p>
-            <w:r>
-              <w:rPr>
-                <w:sz w:val="17"/>
-              </w:rPr>
-              <w:t>100.00%</w:t>
-            </w:r>
-          </w:p>
-        </w:tc>
-        <w:tc>
-          <w:tcPr>
-            <w:tcW w:type="dxa" w:w="1560"/>
-            <w:shd w:val="clear" w:color="auto" w:fill="F8FAFC"/>
-          </w:tcPr>
-          <w:p>
-            <w:r>
-              <w:rPr>
-                <w:sz w:val="17"/>
-              </w:rPr>
-              <w:t>100.00%</w:t>
-            </w:r>
-          </w:p>
-        </w:tc>
-        <w:tc>
-          <w:tcPr>
-            <w:tcW w:type="dxa" w:w="1560"/>
-            <w:shd w:val="clear" w:color="auto" w:fill="F8FAFC"/>
-          </w:tcPr>
-          <w:p>
-            <w:r>
-              <w:rPr>
-                <w:sz w:val="17"/>
-              </w:rPr>
-              <w:t>100.00%</w:t>
-            </w:r>
-          </w:p>
-        </w:tc>
-      </w:tr>
-      <w:tr>
-        <w:tc>
-          <w:tcPr>
-            <w:tcW w:type="dxa" w:w="1560"/>
-          </w:tcPr>
-          <w:p>
-            <w:r>
-              <w:rPr>
-                <w:sz w:val="17"/>
-              </w:rPr>
-              <w:t>Extra Trees Classifier (n=100)</w:t>
-            </w:r>
-          </w:p>
-        </w:tc>
-        <w:tc>
-          <w:tcPr>
-            <w:tcW w:type="dxa" w:w="1560"/>
-          </w:tcPr>
-          <w:p>
-            <w:r>
-              <w:rPr>
-                <w:sz w:val="17"/>
-              </w:rPr>
-              <w:t>100.00%</w:t>
-            </w:r>
-          </w:p>
-        </w:tc>
-        <w:tc>
-          <w:tcPr>
-            <w:tcW w:type="dxa" w:w="1560"/>
-          </w:tcPr>
-          <w:p>
-            <w:r>
-              <w:rPr>
-                <w:sz w:val="17"/>
-              </w:rPr>
-              <w:t>100.00%</w:t>
-            </w:r>
-          </w:p>
-        </w:tc>
-        <w:tc>
-          <w:tcPr>
-            <w:tcW w:type="dxa" w:w="1560"/>
-          </w:tcPr>
-          <w:p>
-            <w:r>
-              <w:rPr>
-                <w:sz w:val="17"/>
-              </w:rPr>
-              <w:t>100.00%</w:t>
-            </w:r>
-          </w:p>
-        </w:tc>
-        <w:tc>
-          <w:tcPr>
-            <w:tcW w:type="dxa" w:w="1560"/>
-          </w:tcPr>
-          <w:p>
-            <w:r>
-              <w:rPr>
-                <w:sz w:val="17"/>
-              </w:rPr>
-              <w:t>100.00%</w:t>
-            </w:r>
-          </w:p>
-        </w:tc>
-        <w:tc>
-          <w:tcPr>
-            <w:tcW w:type="dxa" w:w="1560"/>
-          </w:tcPr>
-          <w:p>
-            <w:r>
-              <w:rPr>
-                <w:sz w:val="17"/>
-              </w:rPr>
-              <w:t>100.00%</w:t>
-            </w:r>
-          </w:p>
-        </w:tc>
-      </w:tr>
     </w:tbl>
     <w:p>
       <w:pPr>
@@ -1496,7 +1084,274 @@
           <w:color w:val="D97706"/>
           <w:sz w:val="28"/>
         </w:rPr>
-        <w:t>3. Implemented Platform Features</w:t>
+        <w:t>3. Role-Based Access Control (RBAC): The 4 User View Types</w:t>
+      </w:r>
+    </w:p>
+    <w:p>
+      <w:pPr>
+        <w:spacing w:after="120" w:line="276" w:lineRule="auto"/>
+      </w:pPr>
+      <w:r>
+        <w:rPr>
+          <w:rFonts w:ascii="Arial" w:hAnsi="Arial"/>
+          <w:color w:val="334155"/>
+          <w:sz w:val="21"/>
+        </w:rPr>
+        <w:t>The platform implements a Role-Based Access Control (RBAC) architecture with 4 specialized User View Types, tailored for different operational personas across Oil India installations:</w:t>
+      </w:r>
+    </w:p>
+    <w:p>
+      <w:pPr>
+        <w:spacing w:before="200" w:after="80"/>
+      </w:pPr>
+      <w:r>
+        <w:rPr>
+          <w:rFonts w:ascii="Arial" w:hAnsi="Arial"/>
+          <w:b/>
+          <w:color w:val="1E293B"/>
+          <w:sz w:val="24"/>
+        </w:rPr>
+        <w:t>View Type 1: HSE Manager View (Executive &amp; Governance Scope)</w:t>
+      </w:r>
+    </w:p>
+    <w:p>
+      <w:pPr>
+        <w:pStyle w:val="ListBullet"/>
+        <w:spacing w:after="80"/>
+      </w:pPr>
+      <w:r>
+        <w:rPr>
+          <w:rFonts w:ascii="Arial" w:hAnsi="Arial"/>
+          <w:b/>
+          <w:color w:val="0F172A"/>
+          <w:sz w:val="20"/>
+        </w:rPr>
+        <w:t xml:space="preserve">Target Persona: </w:t>
+      </w:r>
+      <w:r>
+        <w:rPr>
+          <w:rFonts w:ascii="Arial" w:hAnsi="Arial"/>
+          <w:color w:val="334155"/>
+          <w:sz w:val="20"/>
+        </w:rPr>
+        <w:t>Executive HSSE Leadership &amp; Senior Safety Directors.</w:t>
+      </w:r>
+    </w:p>
+    <w:p>
+      <w:pPr>
+        <w:pStyle w:val="ListBullet"/>
+        <w:spacing w:after="80"/>
+      </w:pPr>
+      <w:r>
+        <w:rPr>
+          <w:rFonts w:ascii="Arial" w:hAnsi="Arial"/>
+          <w:b/>
+          <w:color w:val="0F172A"/>
+          <w:sz w:val="20"/>
+        </w:rPr>
+        <w:t xml:space="preserve">Key Capabilities: </w:t>
+      </w:r>
+      <w:r>
+        <w:rPr>
+          <w:rFonts w:ascii="Arial" w:hAnsi="Arial"/>
+          <w:color w:val="334155"/>
+          <w:sz w:val="20"/>
+        </w:rPr>
+        <w:t>Full administration access, UTF-8 BOM CSV data export (/api/export), model retraining execution, and target tracking (20-25% precursor target window).</w:t>
+      </w:r>
+    </w:p>
+    <w:p>
+      <w:pPr>
+        <w:spacing w:before="200" w:after="80"/>
+      </w:pPr>
+      <w:r>
+        <w:rPr>
+          <w:rFonts w:ascii="Arial" w:hAnsi="Arial"/>
+          <w:b/>
+          <w:color w:val="1E293B"/>
+          <w:sz w:val="24"/>
+        </w:rPr>
+        <w:t>View Type 2: Site Manager View (Installation Scope)</w:t>
+      </w:r>
+    </w:p>
+    <w:p>
+      <w:pPr>
+        <w:pStyle w:val="ListBullet"/>
+        <w:spacing w:after="80"/>
+      </w:pPr>
+      <w:r>
+        <w:rPr>
+          <w:rFonts w:ascii="Arial" w:hAnsi="Arial"/>
+          <w:b/>
+          <w:color w:val="0F172A"/>
+          <w:sz w:val="20"/>
+        </w:rPr>
+        <w:t xml:space="preserve">Target Persona: </w:t>
+      </w:r>
+      <w:r>
+        <w:rPr>
+          <w:rFonts w:ascii="Arial" w:hAnsi="Arial"/>
+          <w:color w:val="334155"/>
+          <w:sz w:val="20"/>
+        </w:rPr>
+        <w:t>Installation Managers &amp; Site Safety Officers at Baghjan, Duliajan, Digboi, and Moran.</w:t>
+      </w:r>
+    </w:p>
+    <w:p>
+      <w:pPr>
+        <w:pStyle w:val="ListBullet"/>
+        <w:spacing w:after="80"/>
+      </w:pPr>
+      <w:r>
+        <w:rPr>
+          <w:rFonts w:ascii="Arial" w:hAnsi="Arial"/>
+          <w:b/>
+          <w:color w:val="0F172A"/>
+          <w:sz w:val="20"/>
+        </w:rPr>
+        <w:t xml:space="preserve">Key Capabilities: </w:t>
+      </w:r>
+      <w:r>
+        <w:rPr>
+          <w:rFonts w:ascii="Arial" w:hAnsi="Arial"/>
+          <w:color w:val="334155"/>
+          <w:sz w:val="20"/>
+        </w:rPr>
+        <w:t>Site-specific risk analysis, historical similar incident retrieval (/api/similar), barrier degradation tracking (Defended, Degraded, Failed), and installation trend monitoring.</w:t>
+      </w:r>
+    </w:p>
+    <w:p>
+      <w:pPr>
+        <w:spacing w:before="200" w:after="80"/>
+      </w:pPr>
+      <w:r>
+        <w:rPr>
+          <w:rFonts w:ascii="Arial" w:hAnsi="Arial"/>
+          <w:b/>
+          <w:color w:val="1E293B"/>
+          <w:sz w:val="24"/>
+        </w:rPr>
+        <w:t>View Type 3: Field Supervisor View (Field Operational Scope)</w:t>
+      </w:r>
+    </w:p>
+    <w:p>
+      <w:pPr>
+        <w:pStyle w:val="ListBullet"/>
+        <w:spacing w:after="80"/>
+      </w:pPr>
+      <w:r>
+        <w:rPr>
+          <w:rFonts w:ascii="Arial" w:hAnsi="Arial"/>
+          <w:b/>
+          <w:color w:val="0F172A"/>
+          <w:sz w:val="20"/>
+        </w:rPr>
+        <w:t xml:space="preserve">Target Persona: </w:t>
+      </w:r>
+      <w:r>
+        <w:rPr>
+          <w:rFonts w:ascii="Arial" w:hAnsi="Arial"/>
+          <w:color w:val="334155"/>
+          <w:sz w:val="20"/>
+        </w:rPr>
+        <w:t>Drilling Rig Supervisors, Maintenance Engineers, and Shift Officers.</w:t>
+      </w:r>
+    </w:p>
+    <w:p>
+      <w:pPr>
+        <w:pStyle w:val="ListBullet"/>
+        <w:spacing w:after="80"/>
+      </w:pPr>
+      <w:r>
+        <w:rPr>
+          <w:rFonts w:ascii="Arial" w:hAnsi="Arial"/>
+          <w:b/>
+          <w:color w:val="0F172A"/>
+          <w:sz w:val="20"/>
+        </w:rPr>
+        <w:t xml:space="preserve">Key Capabilities: </w:t>
+      </w:r>
+      <w:r>
+        <w:rPr>
+          <w:rFonts w:ascii="Arial" w:hAnsi="Arial"/>
+          <w:color w:val="334155"/>
+          <w:sz w:val="20"/>
+        </w:rPr>
+        <w:t>Incident report submission, real-time SIF triage (/api/classify), energy hazard detection, IOGP Life-Saving Rule matching, and Hierarchy of Controls action preview.</w:t>
+      </w:r>
+    </w:p>
+    <w:p>
+      <w:pPr>
+        <w:spacing w:before="200" w:after="80"/>
+      </w:pPr>
+      <w:r>
+        <w:rPr>
+          <w:rFonts w:ascii="Arial" w:hAnsi="Arial"/>
+          <w:b/>
+          <w:color w:val="1E293B"/>
+          <w:sz w:val="24"/>
+        </w:rPr>
+        <w:t>View Type 4: Safety Analyst View (Analytical Scope)</w:t>
+      </w:r>
+    </w:p>
+    <w:p>
+      <w:pPr>
+        <w:pStyle w:val="ListBullet"/>
+        <w:spacing w:after="80"/>
+      </w:pPr>
+      <w:r>
+        <w:rPr>
+          <w:rFonts w:ascii="Arial" w:hAnsi="Arial"/>
+          <w:b/>
+          <w:color w:val="0F172A"/>
+          <w:sz w:val="20"/>
+        </w:rPr>
+        <w:t xml:space="preserve">Target Persona: </w:t>
+      </w:r>
+      <w:r>
+        <w:rPr>
+          <w:rFonts w:ascii="Arial" w:hAnsi="Arial"/>
+          <w:color w:val="334155"/>
+          <w:sz w:val="20"/>
+        </w:rPr>
+        <w:t>Data Analysts, HSSE Researchers, and Incident Investigators.</w:t>
+      </w:r>
+    </w:p>
+    <w:p>
+      <w:pPr>
+        <w:pStyle w:val="ListBullet"/>
+        <w:spacing w:after="80"/>
+      </w:pPr>
+      <w:r>
+        <w:rPr>
+          <w:rFonts w:ascii="Arial" w:hAnsi="Arial"/>
+          <w:b/>
+          <w:color w:val="0F172A"/>
+          <w:sz w:val="20"/>
+        </w:rPr>
+        <w:t xml:space="preserve">Key Capabilities: </w:t>
+      </w:r>
+      <w:r>
+        <w:rPr>
+          <w:rFonts w:ascii="Arial" w:hAnsi="Arial"/>
+          <w:color w:val="334155"/>
+          <w:sz w:val="20"/>
+        </w:rPr>
+        <w:t>Read-only analytics dashboard, deep Safety Knowledge Graph (D3.js) exploration, inspecting relationship paths (Activity -&gt; Hazard -&gt; Barrier -&gt; Rule -&gt; Consequence), and polyfit trend viewing.</w:t>
+      </w:r>
+    </w:p>
+    <w:p>
+      <w:pPr>
+        <w:spacing w:before="280" w:after="120"/>
+      </w:pPr>
+      <w:r>
+        <w:rPr>
+          <w:rFonts w:ascii="Arial" w:hAnsi="Arial"/>
+          <w:b/>
+          <w:color w:val="D97706"/>
+          <w:sz w:val="28"/>
+        </w:rPr>
+        <w:t>4. Summary of Implemented Platform Features</w:t>
       </w:r>
     </w:p>
     <w:p>
@@ -1557,29 +1412,6 @@
           <w:sz w:val="20"/>
         </w:rPr>
         <w:t>Binary classification model for SIF precursor detection and multi-class model for predicting 10 IOGP Life-Saving Rules.</w:t>
-      </w:r>
-    </w:p>
-    <w:p>
-      <w:pPr>
-        <w:pStyle w:val="ListBullet"/>
-        <w:spacing w:after="80"/>
-      </w:pPr>
-      <w:r>
-        <w:rPr>
-          <w:rFonts w:ascii="Arial" w:hAnsi="Arial"/>
-          <w:b/>
-          <w:color w:val="0F172A"/>
-          <w:sz w:val="20"/>
-        </w:rPr>
-        <w:t xml:space="preserve">Numeric SIF Scoring: </w:t>
-      </w:r>
-      <w:r>
-        <w:rPr>
-          <w:rFonts w:ascii="Arial" w:hAnsi="Arial"/>
-          <w:color w:val="334155"/>
-          <w:sz w:val="20"/>
-        </w:rPr>
-        <w:t>Outputs a 0–100% SIF risk probability index and automated audit rationale with OISD action recommendations.</w:t>
       </w:r>
     </w:p>
     <w:p>
@@ -1681,29 +1513,6 @@
     </w:p>
     <w:p>
       <w:pPr>
-        <w:pStyle w:val="ListBullet"/>
-        <w:spacing w:after="80"/>
-      </w:pPr>
-      <w:r>
-        <w:rPr>
-          <w:rFonts w:ascii="Arial" w:hAnsi="Arial"/>
-          <w:b/>
-          <w:color w:val="0F172A"/>
-          <w:sz w:val="20"/>
-        </w:rPr>
-        <w:t xml:space="preserve">Near-Miss Retrieval: </w:t>
-      </w:r>
-      <w:r>
-        <w:rPr>
-          <w:rFonts w:ascii="Arial" w:hAnsi="Arial"/>
-          <w:color w:val="334155"/>
-          <w:sz w:val="20"/>
-        </w:rPr>
-        <w:t>Instant search returning top historical matching incidents, past barrier failures, and previously applied corrective measures.</w:t>
-      </w:r>
-    </w:p>
-    <w:p>
-      <w:pPr>
         <w:spacing w:before="200" w:after="80"/>
       </w:pPr>
       <w:r>
@@ -1737,29 +1546,6 @@
           <w:sz w:val="20"/>
         </w:rPr>
         <w:t>Polynomial regression calculating 30-day and 60-day projected SIF precursor rates.</w:t>
-      </w:r>
-    </w:p>
-    <w:p>
-      <w:pPr>
-        <w:pStyle w:val="ListBullet"/>
-        <w:spacing w:after="80"/>
-      </w:pPr>
-      <w:r>
-        <w:rPr>
-          <w:rFonts w:ascii="Arial" w:hAnsi="Arial"/>
-          <w:b/>
-          <w:color w:val="0F172A"/>
-          <w:sz w:val="20"/>
-        </w:rPr>
-        <w:t xml:space="preserve">Real-Time Visualizations: </w:t>
-      </w:r>
-      <w:r>
-        <w:rPr>
-          <w:rFonts w:ascii="Arial" w:hAnsi="Arial"/>
-          <w:color w:val="334155"/>
-          <w:sz w:val="20"/>
-        </w:rPr>
-        <w:t>Interactive charts for Monthly Trends, Hazard Breakdown, Barrier Conditions, and Severity Donut Chart.</w:t>
       </w:r>
     </w:p>
     <w:p>
@@ -1810,44 +1596,7 @@
           <w:color w:val="1E293B"/>
           <w:sz w:val="24"/>
         </w:rPr>
-        <w:t>Feature 6: Role-Based Access Control (RBAC) System</w:t>
-      </w:r>
-    </w:p>
-    <w:p>
-      <w:pPr>
-        <w:pStyle w:val="ListBullet"/>
-        <w:spacing w:after="80"/>
-      </w:pPr>
-      <w:r>
-        <w:rPr>
-          <w:rFonts w:ascii="Arial" w:hAnsi="Arial"/>
-          <w:b/>
-          <w:color w:val="0F172A"/>
-          <w:sz w:val="20"/>
-        </w:rPr>
-        <w:t xml:space="preserve">Enterprise Roles: </w:t>
-      </w:r>
-      <w:r>
-        <w:rPr>
-          <w:rFonts w:ascii="Arial" w:hAnsi="Arial"/>
-          <w:color w:val="334155"/>
-          <w:sz w:val="20"/>
-        </w:rPr>
-        <w:t>Configured for HSE Manager, Site Manager, Field Supervisor, and Safety Analyst with scoped permissions.</w:t>
-      </w:r>
-    </w:p>
-    <w:p>
-      <w:pPr>
-        <w:spacing w:before="200" w:after="80"/>
-      </w:pPr>
-      <w:r>
-        <w:rPr>
-          <w:rFonts w:ascii="Arial" w:hAnsi="Arial"/>
-          <w:b/>
-          <w:color w:val="1E293B"/>
-          <w:sz w:val="24"/>
-        </w:rPr>
-        <w:t>Feature 7: Multi-Site Hero Carousel &amp; Visual Monitoring</w:t>
+        <w:t>Feature 6: Multi-Site Hero Carousel &amp; Visual Monitoring</w:t>
       </w:r>
     </w:p>
     <w:p>
@@ -1884,7 +1633,7 @@
           <w:color w:val="D97706"/>
           <w:sz w:val="28"/>
         </w:rPr>
-        <w:t>4. REST API Specifications</w:t>
+        <w:t>5. REST API Specifications</w:t>
       </w:r>
     </w:p>
     <w:tbl>

</xml_diff>